<commit_message>
Reboot do PrimeCoding: revendedor autônomo de três notebooks seminovos
A ideia deixa de ser uma loja de dois notebooks novos e passa a ser um
revendedor autônomo (MEI) de notebooks seminovos revisados, em três
linhas: Entrada (ThinkPad T14 Gen 2), Intermediário (Dell Latitude 5430)
e Pro (MacBook Air M2), com kit de setup grátis, upgrade opcional e 90
dias de garantia.

- Dor do cliente em uma página, com os nomes do Grupo 06
- Casos de uso com unidade revisada, kit de setup, upgrade, garantia e
  o painel do revendedor
- Regras de negócio RN01 a RN26 e fluxo do pedido com os status novos
- Modelo de dados com 13 tabelas, script MySQL e modelo do UniModeler
- Protótipo com 14 telas
- README com o grupo e os três modelos
</commit_message>
<xml_diff>
--- a/01-dor-do-cliente/PrimeCoding - Dor do cliente.docx
+++ b/01-dor-do-cliente/PrimeCoding - Dor do cliente.docx
@@ -9,9 +9,33 @@
       <w:r>
         <w:rPr>
           <w:b/>
-          <w:sz w:val="48"/>
+          <w:sz w:val="40"/>
         </w:rPr>
         <w:t>PrimeCoding</w:t>
+      </w:r>
+    </w:p>
+    <w:p>
+      <w:pPr>
+        <w:spacing w:after="0"/>
+      </w:pPr>
+      <w:r>
+        <w:rPr>
+          <w:color w:val="5A5C63"/>
+          <w:sz w:val="24"/>
+        </w:rPr>
+        <w:t>A dor do cliente: por que alguém compraria neste site</w:t>
+      </w:r>
+    </w:p>
+    <w:p>
+      <w:pPr>
+        <w:spacing w:after="0"/>
+      </w:pPr>
+      <w:r>
+        <w:rPr>
+          <w:color w:val="5A5C63"/>
+          <w:sz w:val="17"/>
+        </w:rPr>
+        <w:t>primecoding.com.br  |  Grupo 06  |  outubro de 2026</w:t>
       </w:r>
     </w:p>
     <w:p>
@@ -21,21 +45,9 @@
       <w:r>
         <w:rPr>
           <w:color w:val="5A5C63"/>
-          <w:sz w:val="26"/>
+          <w:sz w:val="17"/>
         </w:rPr>
-        <w:t>A dor do cliente: por que alguém compraria neste site</w:t>
-      </w:r>
-    </w:p>
-    <w:p>
-      <w:pPr>
-        <w:spacing w:after="200"/>
-      </w:pPr>
-      <w:r>
-        <w:rPr>
-          <w:color w:val="5A5C63"/>
-          <w:sz w:val="19"/>
-        </w:rPr>
-        <w:t>primecoding.com.br  |  FELIPE FARIA DA FONSECA  |  outubro de 2026</w:t>
+        <w:t>PAULO HENRIQUE DE CASTRO LIMA  |  EDUARDO ALMEIDA OLIVEIRA  |  FELIPE FARIA DA FONSECA  |  JOSE VICTOR SOUZA DE ABREU</w:t>
       </w:r>
     </w:p>
     <w:p>
@@ -48,12 +60,24 @@
     </w:p>
     <w:p>
       <w:r>
-        <w:t>Quem trabalha ou estuda TI passa o dia inteiro no notebook. Para essa pessoa, o notebook é ferramenta de trabalho: custa caro, vai durar anos e precisa aguentar IDE, Docker, máquina virtual e dezenas de abas ao mesmo tempo. Mesmo assim, a compra acontece em lojas que vendem de tudo, com anúncios feitos para o público geral e atendimento que não sabe responder as perguntas de quem programa.</w:t>
+        <w:t>Quem estuda ou começa em TI precisa de um notebook que aguente IDE, banco de dados e Docker, mas um novo assim pesa no bolso. O caminho é o seminovo, e aí cada anúncio é uma aposta: foto de catálogo, bateria desconhecida, sem nota e sem garantia. E mesmo quando chega bem, o notebook ainda não está pronto para programar.</w:t>
       </w:r>
     </w:p>
     <w:p>
       <w:r>
-        <w:t>O PrimeCoding existe para resolver isso: uma loja com só dois notebooks, escolhidos para desenvolvimento, explicados na linguagem de quem programa, com a compra fechada numa conversa pelo WhatsApp.</w:t>
+        <w:t>O PrimeCoding é a loja de um revendedor autônomo (MEI). Ele compra lotes de empresas que renovam os equipamentos e vende só três modelos seminovos, cada unidade revisada, com fotos reais e bateria conferida, entregue pronta para programar e com 90 dias de garantia. A compra é fechada pelo WhatsApp.</w:t>
+      </w:r>
+    </w:p>
+    <w:p>
+      <w:r>
+        <w:rPr>
+          <w:b/>
+        </w:rPr>
+        <w:t xml:space="preserve">Para quem é: </w:t>
+      </w:r>
+      <w:r/>
+      <w:r>
+        <w:t>estudantes de TI (ADS, Computação, cursos técnicos), quem começa na área (estágio, primeiro emprego, transição de carreira) e desenvolvedores PJ que querem trocar de máquina gastando menos, com nota no CNPJ.</w:t>
       </w:r>
     </w:p>
     <w:p>
@@ -61,60 +85,7 @@
         <w:pStyle w:val="Heading1"/>
       </w:pPr>
       <w:r>
-        <w:t>2. Para quem é</w:t>
-      </w:r>
-    </w:p>
-    <w:p>
-      <w:pPr>
-        <w:pStyle w:val="ListBullet"/>
-        <w:spacing w:after="60"/>
-      </w:pPr>
-      <w:r>
-        <w:rPr>
-          <w:b/>
-        </w:rPr>
-        <w:t xml:space="preserve">Profissionais de TI: </w:t>
-      </w:r>
-      <w:r>
-        <w:t>desenvolvedores (front-end, back-end, mobile, dados), muitos trabalhando como PJ;</w:t>
-      </w:r>
-    </w:p>
-    <w:p>
-      <w:pPr>
-        <w:pStyle w:val="ListBullet"/>
-        <w:spacing w:after="60"/>
-      </w:pPr>
-      <w:r>
-        <w:rPr>
-          <w:b/>
-        </w:rPr>
-        <w:t xml:space="preserve">Estudantes: </w:t>
-      </w:r>
-      <w:r>
-        <w:t>alunos de ADS, Ciência da Computação, Engenharia de Software e cursos técnicos;</w:t>
-      </w:r>
-    </w:p>
-    <w:p>
-      <w:pPr>
-        <w:pStyle w:val="ListBullet"/>
-        <w:spacing w:after="60"/>
-      </w:pPr>
-      <w:r>
-        <w:rPr>
-          <w:b/>
-        </w:rPr>
-        <w:t xml:space="preserve">Infraestrutura e suporte: </w:t>
-      </w:r>
-      <w:r>
-        <w:t>quem dá suporte, administra servidores ou trabalha com cloud e precisa de um notebook confiável.</w:t>
-      </w:r>
-    </w:p>
-    <w:p>
-      <w:pPr>
-        <w:pStyle w:val="Heading1"/>
-      </w:pPr>
-      <w:r>
-        <w:t>3. As dores e como o site resolve cada uma</w:t>
+        <w:t>2. As dores e como o site resolve cada uma</w:t>
       </w:r>
     </w:p>
     <w:tbl>
@@ -125,14 +96,11 @@
         <w:tblLook w:firstColumn="1" w:firstRow="1" w:lastColumn="0" w:lastRow="0" w:noHBand="0" w:noVBand="1" w:val="04A0"/>
       </w:tblPr>
       <w:tblGrid>
-        <w:gridCol w:w="3173"/>
-        <w:gridCol w:w="3173"/>
-        <w:gridCol w:w="3173"/>
+        <w:gridCol w:w="3289"/>
+        <w:gridCol w:w="3289"/>
+        <w:gridCol w:w="3289"/>
       </w:tblGrid>
       <w:tr>
-        <w:trPr>
-          <w:cantSplit w:val="true"/>
-        </w:trPr>
         <w:tc>
           <w:tcPr>
             <w:tcW w:type="dxa" w:w="1928"/>
@@ -140,14 +108,14 @@
           </w:tcPr>
           <w:p>
             <w:pPr>
-              <w:spacing w:after="40" w:line="252" w:lineRule="auto"/>
+              <w:spacing w:after="0" w:line="240" w:lineRule="auto"/>
             </w:pPr>
             <w:r/>
             <w:r>
               <w:rPr>
                 <w:b/>
                 <w:color w:val="FFFFFF"/>
-                <w:sz w:val="20"/>
+                <w:sz w:val="18"/>
               </w:rPr>
               <w:t>Dor</w:t>
             </w:r>
@@ -160,14 +128,14 @@
           </w:tcPr>
           <w:p>
             <w:pPr>
-              <w:spacing w:after="40" w:line="252" w:lineRule="auto"/>
+              <w:spacing w:after="0" w:line="240" w:lineRule="auto"/>
             </w:pPr>
             <w:r/>
             <w:r>
               <w:rPr>
                 <w:b/>
                 <w:color w:val="FFFFFF"/>
-                <w:sz w:val="20"/>
+                <w:sz w:val="18"/>
               </w:rPr>
               <w:t>O que o cliente vive hoje</w:t>
             </w:r>
@@ -175,19 +143,19 @@
         </w:tc>
         <w:tc>
           <w:tcPr>
-            <w:tcW w:type="dxa" w:w="3742"/>
+            <w:tcW w:type="dxa" w:w="4422"/>
             <w:shd w:val="clear" w:color="auto" w:fill="2B2D31"/>
           </w:tcPr>
           <w:p>
             <w:pPr>
-              <w:spacing w:after="40" w:line="252" w:lineRule="auto"/>
+              <w:spacing w:after="0" w:line="240" w:lineRule="auto"/>
             </w:pPr>
             <w:r/>
             <w:r>
               <w:rPr>
                 <w:b/>
                 <w:color w:val="FFFFFF"/>
-                <w:sz w:val="20"/>
+                <w:sz w:val="18"/>
               </w:rPr>
               <w:t>Como o PrimeCoding resolve</w:t>
             </w:r>
@@ -195,24 +163,21 @@
         </w:tc>
       </w:tr>
       <w:tr>
-        <w:trPr>
-          <w:cantSplit w:val="true"/>
-        </w:trPr>
         <w:tc>
           <w:tcPr>
             <w:tcW w:type="dxa" w:w="1928"/>
           </w:tcPr>
           <w:p>
             <w:pPr>
-              <w:spacing w:after="40" w:line="252" w:lineRule="auto"/>
+              <w:spacing w:after="0" w:line="240" w:lineRule="auto"/>
             </w:pPr>
             <w:r/>
             <w:r>
               <w:rPr>
                 <w:b/>
-                <w:sz w:val="20"/>
+                <w:sz w:val="18"/>
               </w:rPr>
-              <w:t>Excesso de opções</w:t>
+              <w:t>Seminovo é loteria</w:t>
             </w:r>
           </w:p>
         </w:tc>
@@ -222,54 +187,51 @@
           </w:tcPr>
           <w:p>
             <w:pPr>
-              <w:spacing w:after="40" w:line="252" w:lineRule="auto"/>
+              <w:spacing w:after="0" w:line="240" w:lineRule="auto"/>
             </w:pPr>
             <w:r/>
             <w:r>
               <w:rPr>
-                <w:sz w:val="20"/>
+                <w:sz w:val="18"/>
               </w:rPr>
-              <w:t>Dezenas de modelos, configurações e vendedores. Comparar exige abrir dez abas e ler fichas escritas de jeitos diferentes.</w:t>
+              <w:t>Foto de catálogo, sem dizer o estado nem quanto a bateria aguenta.</w:t>
             </w:r>
           </w:p>
         </w:tc>
         <w:tc>
           <w:tcPr>
-            <w:tcW w:type="dxa" w:w="3742"/>
+            <w:tcW w:type="dxa" w:w="4422"/>
           </w:tcPr>
           <w:p>
             <w:pPr>
-              <w:spacing w:after="40" w:line="252" w:lineRule="auto"/>
+              <w:spacing w:after="0" w:line="240" w:lineRule="auto"/>
             </w:pPr>
             <w:r/>
             <w:r>
               <w:rPr>
-                <w:sz w:val="20"/>
+                <w:sz w:val="18"/>
               </w:rPr>
-              <w:t>Só dois notebooks, um com macOS e um com Windows, e uma página que compara os dois linha a linha.</w:t>
+              <w:t>Cada unidade tem estado (A ou B), saúde da bateria e fotos reais. Bateria abaixo de 80% é trocada.</w:t>
             </w:r>
           </w:p>
         </w:tc>
       </w:tr>
       <w:tr>
-        <w:trPr>
-          <w:cantSplit w:val="true"/>
-        </w:trPr>
         <w:tc>
           <w:tcPr>
             <w:tcW w:type="dxa" w:w="1928"/>
           </w:tcPr>
           <w:p>
             <w:pPr>
-              <w:spacing w:after="40" w:line="252" w:lineRule="auto"/>
+              <w:spacing w:after="0" w:line="240" w:lineRule="auto"/>
             </w:pPr>
             <w:r/>
             <w:r>
               <w:rPr>
                 <w:b/>
-                <w:sz w:val="20"/>
+                <w:sz w:val="18"/>
               </w:rPr>
-              <w:t>Ficha técnica que não fala com quem programa</w:t>
+              <w:t>Medo de golpe</w:t>
             </w:r>
           </w:p>
         </w:tc>
@@ -279,54 +241,51 @@
           </w:tcPr>
           <w:p>
             <w:pPr>
-              <w:spacing w:after="40" w:line="252" w:lineRule="auto"/>
+              <w:spacing w:after="0" w:line="240" w:lineRule="auto"/>
             </w:pPr>
             <w:r/>
             <w:r>
               <w:rPr>
-                <w:sz w:val="20"/>
+                <w:sz w:val="18"/>
               </w:rPr>
-              <w:t>O anúncio diz "ideal para estudos e trabalho", mas não diz se roda Docker, máquina virtual, Xcode ou Android Studio.</w:t>
+              <w:t>Venda entre pessoas não tem nota nem garantia.</w:t>
             </w:r>
           </w:p>
         </w:tc>
         <w:tc>
           <w:tcPr>
-            <w:tcW w:type="dxa" w:w="3742"/>
+            <w:tcW w:type="dxa" w:w="4422"/>
           </w:tcPr>
           <w:p>
             <w:pPr>
-              <w:spacing w:after="40" w:line="252" w:lineRule="auto"/>
+              <w:spacing w:after="0" w:line="240" w:lineRule="auto"/>
             </w:pPr>
             <w:r/>
             <w:r>
               <w:rPr>
-                <w:sz w:val="20"/>
+                <w:sz w:val="18"/>
               </w:rPr>
-              <w:t>Ficha técnica completa e uma seção "na prática" que diz para que perfil cada notebook serve.</w:t>
+              <w:t>Nota no CPF ou CNPJ, 90 dias de garantia (conserto ou troca em até 10 dias úteis) e 7 dias para desistir.</w:t>
             </w:r>
           </w:p>
         </w:tc>
       </w:tr>
       <w:tr>
-        <w:trPr>
-          <w:cantSplit w:val="true"/>
-        </w:trPr>
         <w:tc>
           <w:tcPr>
             <w:tcW w:type="dxa" w:w="1928"/>
           </w:tcPr>
           <w:p>
             <w:pPr>
-              <w:spacing w:after="40" w:line="252" w:lineRule="auto"/>
+              <w:spacing w:after="0" w:line="240" w:lineRule="auto"/>
             </w:pPr>
             <w:r/>
             <w:r>
               <w:rPr>
                 <w:b/>
-                <w:sz w:val="20"/>
+                <w:sz w:val="18"/>
               </w:rPr>
-              <w:t>Ninguém para tirar dúvida técnica</w:t>
+              <w:t>Notebook bom é caro</w:t>
             </w:r>
           </w:p>
         </w:tc>
@@ -336,54 +295,51 @@
           </w:tcPr>
           <w:p>
             <w:pPr>
-              <w:spacing w:after="40" w:line="252" w:lineRule="auto"/>
+              <w:spacing w:after="0" w:line="240" w:lineRule="auto"/>
             </w:pPr>
             <w:r/>
             <w:r>
               <w:rPr>
-                <w:sz w:val="20"/>
+                <w:sz w:val="18"/>
               </w:rPr>
-              <w:t>O chat da loja grande é um robô ou um atendente que não sabe o que é WSL ou memória unificada.</w:t>
+              <w:t>16 ou 32 GB novos fogem do orçamento de quem está começando.</w:t>
             </w:r>
           </w:p>
         </w:tc>
         <w:tc>
           <w:tcPr>
-            <w:tcW w:type="dxa" w:w="3742"/>
+            <w:tcW w:type="dxa" w:w="4422"/>
           </w:tcPr>
           <w:p>
             <w:pPr>
-              <w:spacing w:after="40" w:line="252" w:lineRule="auto"/>
+              <w:spacing w:after="0" w:line="240" w:lineRule="auto"/>
             </w:pPr>
             <w:r/>
             <w:r>
               <w:rPr>
-                <w:sz w:val="20"/>
+                <w:sz w:val="18"/>
               </w:rPr>
-              <w:t>Atendimento pelo WhatsApp com quem conhece os dois notebooks, antes e depois da compra.</w:t>
+              <w:t>Linhas empresariais seminovas a partir de R$ 2.899,00, em 12x sem juros ou com 10% off no PIX.</w:t>
             </w:r>
           </w:p>
         </w:tc>
       </w:tr>
       <w:tr>
-        <w:trPr>
-          <w:cantSplit w:val="true"/>
-        </w:trPr>
         <w:tc>
           <w:tcPr>
             <w:tcW w:type="dxa" w:w="1928"/>
           </w:tcPr>
           <w:p>
             <w:pPr>
-              <w:spacing w:after="40" w:line="252" w:lineRule="auto"/>
+              <w:spacing w:after="0" w:line="240" w:lineRule="auto"/>
             </w:pPr>
             <w:r/>
             <w:r>
               <w:rPr>
                 <w:b/>
-                <w:sz w:val="20"/>
+                <w:sz w:val="18"/>
               </w:rPr>
-              <w:t>Medo de golpe e de produto sem garantia</w:t>
+              <w:t>Ficha que não fala com quem programa</w:t>
             </w:r>
           </w:p>
         </w:tc>
@@ -393,54 +349,51 @@
           </w:tcPr>
           <w:p>
             <w:pPr>
-              <w:spacing w:after="40" w:line="252" w:lineRule="auto"/>
+              <w:spacing w:after="0" w:line="240" w:lineRule="auto"/>
             </w:pPr>
             <w:r/>
             <w:r>
               <w:rPr>
-                <w:sz w:val="20"/>
+                <w:sz w:val="18"/>
               </w:rPr>
-              <w:t>Preço baixo demais em marketplace, produto importado sem garantia no Brasil, teclado diferente do anunciado.</w:t>
+              <w:t>O anúncio não diz se roda Docker, máquina virtual ou Xcode.</w:t>
             </w:r>
           </w:p>
         </w:tc>
         <w:tc>
           <w:tcPr>
-            <w:tcW w:type="dxa" w:w="3742"/>
+            <w:tcW w:type="dxa" w:w="4422"/>
           </w:tcPr>
           <w:p>
             <w:pPr>
-              <w:spacing w:after="40" w:line="252" w:lineRule="auto"/>
+              <w:spacing w:after="0" w:line="240" w:lineRule="auto"/>
             </w:pPr>
             <w:r/>
             <w:r>
               <w:rPr>
-                <w:sz w:val="20"/>
+                <w:sz w:val="18"/>
               </w:rPr>
-              <w:t>Produto novo e lacrado, nota fiscal, garantia oficial de 1 ano no Brasil e teclado informado na ficha (ABNT2).</w:t>
+              <w:t>Três linhas, Entrada, Intermediário e Pro, explicadas pelo que aguentam na prática.</w:t>
             </w:r>
           </w:p>
         </w:tc>
       </w:tr>
       <w:tr>
-        <w:trPr>
-          <w:cantSplit w:val="true"/>
-        </w:trPr>
         <w:tc>
           <w:tcPr>
             <w:tcW w:type="dxa" w:w="1928"/>
           </w:tcPr>
           <w:p>
             <w:pPr>
-              <w:spacing w:after="40" w:line="252" w:lineRule="auto"/>
+              <w:spacing w:after="0" w:line="240" w:lineRule="auto"/>
             </w:pPr>
             <w:r/>
             <w:r>
               <w:rPr>
                 <w:b/>
-                <w:sz w:val="20"/>
+                <w:sz w:val="18"/>
               </w:rPr>
-              <w:t>Nota fiscal no CNPJ</w:t>
+              <w:t>Preparar o ambiente</w:t>
             </w:r>
           </w:p>
         </w:tc>
@@ -450,52 +403,49 @@
           </w:tcPr>
           <w:p>
             <w:pPr>
-              <w:spacing w:after="40" w:line="252" w:lineRule="auto"/>
+              <w:spacing w:after="0" w:line="240" w:lineRule="auto"/>
             </w:pPr>
             <w:r/>
             <w:r>
               <w:rPr>
-                <w:sz w:val="20"/>
+                <w:sz w:val="18"/>
               </w:rPr>
-              <w:t>Quem trabalha como PJ quer a nota no CNPJ, e nem toda loja deixa escolher na hora da compra.</w:t>
+              <w:t>Um fim de semana instalando Git, IDE, Docker, WSL e SDKs.</w:t>
             </w:r>
           </w:p>
         </w:tc>
         <w:tc>
           <w:tcPr>
-            <w:tcW w:type="dxa" w:w="3742"/>
+            <w:tcW w:type="dxa" w:w="4422"/>
           </w:tcPr>
           <w:p>
             <w:pPr>
-              <w:spacing w:after="40" w:line="252" w:lineRule="auto"/>
+              <w:spacing w:after="0" w:line="240" w:lineRule="auto"/>
             </w:pPr>
             <w:r/>
             <w:r>
               <w:rPr>
-                <w:sz w:val="20"/>
+                <w:sz w:val="18"/>
               </w:rPr>
-              <w:t>No pedido o cliente escolhe CPF ou CNPJ, e a nota sai no documento informado.</w:t>
+              <w:t>Kit de setup grátis no pedido: Estudante, Back-end, Front-end, Dados ou Mobile.</w:t>
             </w:r>
           </w:p>
         </w:tc>
       </w:tr>
       <w:tr>
-        <w:trPr>
-          <w:cantSplit w:val="true"/>
-        </w:trPr>
         <w:tc>
           <w:tcPr>
             <w:tcW w:type="dxa" w:w="1928"/>
           </w:tcPr>
           <w:p>
             <w:pPr>
-              <w:spacing w:after="40" w:line="252" w:lineRule="auto"/>
+              <w:spacing w:after="0" w:line="240" w:lineRule="auto"/>
             </w:pPr>
             <w:r/>
             <w:r>
               <w:rPr>
                 <w:b/>
-                <w:sz w:val="20"/>
+                <w:sz w:val="18"/>
               </w:rPr>
               <w:t>Checkout longo e frio</w:t>
             </w:r>
@@ -507,31 +457,31 @@
           </w:tcPr>
           <w:p>
             <w:pPr>
-              <w:spacing w:after="40" w:line="252" w:lineRule="auto"/>
+              <w:spacing w:after="0" w:line="240" w:lineRule="auto"/>
             </w:pPr>
             <w:r/>
             <w:r>
               <w:rPr>
-                <w:sz w:val="20"/>
+                <w:sz w:val="18"/>
               </w:rPr>
-              <w:t>Criar conta, inventar senha e passar por várias etapas para uma compra de milhares de reais, sem falar com ninguém.</w:t>
+              <w:t>Conta, senha e várias etapas, sem falar com ninguém.</w:t>
             </w:r>
           </w:p>
         </w:tc>
         <w:tc>
           <w:tcPr>
-            <w:tcW w:type="dxa" w:w="3742"/>
+            <w:tcW w:type="dxa" w:w="4422"/>
           </w:tcPr>
           <w:p>
             <w:pPr>
-              <w:spacing w:after="40" w:line="252" w:lineRule="auto"/>
+              <w:spacing w:after="0" w:line="240" w:lineRule="auto"/>
             </w:pPr>
             <w:r/>
             <w:r>
               <w:rPr>
-                <w:sz w:val="20"/>
+                <w:sz w:val="18"/>
               </w:rPr>
-              <w:t>Sem cadastro e sem senha: um formulário curto e o pedido segue no WhatsApp, com 10% de desconto no PIX ou 12x sem juros.</w:t>
+              <w:t>Sem cadastro: formulário curto e o pedido segue no WhatsApp.</w:t>
             </w:r>
           </w:p>
         </w:tc>
@@ -539,82 +489,10 @@
     </w:tbl>
     <w:p>
       <w:pPr>
-        <w:spacing w:after="40"/>
-      </w:pPr>
-    </w:p>
-    <w:p>
-      <w:pPr>
         <w:pStyle w:val="Heading1"/>
       </w:pPr>
       <w:r>
-        <w:t>4. Personas</w:t>
-      </w:r>
-    </w:p>
-    <w:p>
-      <w:r>
-        <w:rPr>
-          <w:color w:val="5A5C63"/>
-          <w:sz w:val="19"/>
-        </w:rPr>
-        <w:t>Pessoas fictícias, montadas para representar o público do site.</w:t>
-      </w:r>
-    </w:p>
-    <w:p>
-      <w:pPr>
-        <w:pStyle w:val="Heading2"/>
-      </w:pPr>
-      <w:r>
-        <w:t>Lucas, 27 anos, desenvolvedor back-end (PJ)</w:t>
-      </w:r>
-    </w:p>
-    <w:p>
-      <w:r>
-        <w:t>Trabalha com Java e Docker em casa e quer começar a fazer aplicativos para iPhone. Já viu MacBook barato em marketplace e desconfiou. Quer saber se 24 GB de memória dão conta dos containers e precisa da nota fiscal no CNPJ da empresa dele.</w:t>
-      </w:r>
-    </w:p>
-    <w:p>
-      <w:r>
-        <w:rPr>
-          <w:b/>
-        </w:rPr>
-        <w:t xml:space="preserve">No PrimeCoding: </w:t>
-      </w:r>
-      <w:r/>
-      <w:r>
-        <w:t>vê na ficha que o Xcode só roda no macOS, tira a dúvida da memória pelo WhatsApp, informa o CNPJ no pedido e paga no PIX com 10% de desconto.</w:t>
-      </w:r>
-    </w:p>
-    <w:p>
-      <w:pPr>
-        <w:pStyle w:val="Heading2"/>
-      </w:pPr>
-      <w:r>
-        <w:t>Mariana, 20 anos, estudante de ADS</w:t>
-      </w:r>
-    </w:p>
-    <w:p>
-      <w:r>
-        <w:t>Estuda C# e .NET, usa Windows e leva o notebook para a faculdade todo dia. Precisa de algo leve, com bateria para o dia e que caiba no orçamento parcelado. Fica perdida entre tantos modelos parecidos.</w:t>
-      </w:r>
-    </w:p>
-    <w:p>
-      <w:r>
-        <w:rPr>
-          <w:b/>
-        </w:rPr>
-        <w:t xml:space="preserve">No PrimeCoding: </w:t>
-      </w:r>
-      <w:r/>
-      <w:r>
-        <w:t>compara os dois, entende que o Galaxy Book6 Pro (1,24 kg, Windows 11) atende o curso dela e fecha em 12x sem juros, sem criar conta.</w:t>
-      </w:r>
-    </w:p>
-    <w:p>
-      <w:pPr>
-        <w:pStyle w:val="Heading1"/>
-      </w:pPr>
-      <w:r>
-        <w:t>5. Os dois produtos</w:t>
+        <w:t>3. Os três modelos (preços de outubro de 2026)</w:t>
       </w:r>
     </w:p>
     <w:tbl>
@@ -625,29 +503,47 @@
         <w:tblLook w:firstColumn="1" w:firstRow="1" w:lastColumn="0" w:lastRow="0" w:noHBand="0" w:noVBand="1" w:val="04A0"/>
       </w:tblPr>
       <w:tblGrid>
-        <w:gridCol w:w="3173"/>
-        <w:gridCol w:w="3173"/>
-        <w:gridCol w:w="3173"/>
+        <w:gridCol w:w="2466"/>
+        <w:gridCol w:w="2466"/>
+        <w:gridCol w:w="2466"/>
+        <w:gridCol w:w="2466"/>
       </w:tblGrid>
       <w:tr>
-        <w:trPr>
-          <w:cantSplit w:val="true"/>
-        </w:trPr>
         <w:tc>
           <w:tcPr>
-            <w:tcW w:type="dxa" w:w="2835"/>
+            <w:tcW w:type="dxa" w:w="1304"/>
             <w:shd w:val="clear" w:color="auto" w:fill="2B2D31"/>
           </w:tcPr>
           <w:p>
             <w:pPr>
-              <w:spacing w:after="40" w:line="252" w:lineRule="auto"/>
+              <w:spacing w:after="0" w:line="240" w:lineRule="auto"/>
             </w:pPr>
             <w:r/>
             <w:r>
               <w:rPr>
                 <w:b/>
                 <w:color w:val="FFFFFF"/>
-                <w:sz w:val="20"/>
+                <w:sz w:val="18"/>
+              </w:rPr>
+              <w:t>Linha</w:t>
+            </w:r>
+          </w:p>
+        </w:tc>
+        <w:tc>
+          <w:tcPr>
+            <w:tcW w:type="dxa" w:w="2608"/>
+            <w:shd w:val="clear" w:color="auto" w:fill="2B2D31"/>
+          </w:tcPr>
+          <w:p>
+            <w:pPr>
+              <w:spacing w:after="0" w:line="240" w:lineRule="auto"/>
+            </w:pPr>
+            <w:r/>
+            <w:r>
+              <w:rPr>
+                <w:b/>
+                <w:color w:val="FFFFFF"/>
+                <w:sz w:val="18"/>
               </w:rPr>
               <w:t>Notebook</w:t>
             </w:r>
@@ -655,19 +551,19 @@
         </w:tc>
         <w:tc>
           <w:tcPr>
-            <w:tcW w:type="dxa" w:w="4195"/>
+            <w:tcW w:type="dxa" w:w="3005"/>
             <w:shd w:val="clear" w:color="auto" w:fill="2B2D31"/>
           </w:tcPr>
           <w:p>
             <w:pPr>
-              <w:spacing w:after="40" w:line="252" w:lineRule="auto"/>
+              <w:spacing w:after="0" w:line="240" w:lineRule="auto"/>
             </w:pPr>
             <w:r/>
             <w:r>
               <w:rPr>
                 <w:b/>
                 <w:color w:val="FFFFFF"/>
-                <w:sz w:val="20"/>
+                <w:sz w:val="18"/>
               </w:rPr>
               <w:t>Para quem</w:t>
             </w:r>
@@ -675,19 +571,19 @@
         </w:tc>
         <w:tc>
           <w:tcPr>
-            <w:tcW w:type="dxa" w:w="2154"/>
+            <w:tcW w:type="dxa" w:w="2948"/>
             <w:shd w:val="clear" w:color="auto" w:fill="2B2D31"/>
           </w:tcPr>
           <w:p>
             <w:pPr>
-              <w:spacing w:after="40" w:line="252" w:lineRule="auto"/>
+              <w:spacing w:after="0" w:line="240" w:lineRule="auto"/>
             </w:pPr>
             <w:r/>
             <w:r>
               <w:rPr>
                 <w:b/>
                 <w:color w:val="FFFFFF"/>
-                <w:sz w:val="20"/>
+                <w:sz w:val="18"/>
               </w:rPr>
               <w:t>Preço</w:t>
             </w:r>
@@ -695,123 +591,226 @@
         </w:tc>
       </w:tr>
       <w:tr>
-        <w:trPr>
-          <w:cantSplit w:val="true"/>
-        </w:trPr>
         <w:tc>
           <w:tcPr>
-            <w:tcW w:type="dxa" w:w="2835"/>
+            <w:tcW w:type="dxa" w:w="1304"/>
           </w:tcPr>
           <w:p>
             <w:pPr>
-              <w:spacing w:after="40" w:line="252" w:lineRule="auto"/>
+              <w:spacing w:after="0" w:line="240" w:lineRule="auto"/>
             </w:pPr>
             <w:r/>
             <w:r>
               <w:rPr>
                 <w:b/>
-                <w:sz w:val="20"/>
+                <w:sz w:val="18"/>
               </w:rPr>
-              <w:t>MacBook Pro 14 (M5 Pro)</w:t>
-              <w:br/>
-              <w:t>24 GB, SSD 1 TB</w:t>
+              <w:t>Entrada</w:t>
             </w:r>
           </w:p>
         </w:tc>
         <w:tc>
           <w:tcPr>
-            <w:tcW w:type="dxa" w:w="4195"/>
+            <w:tcW w:type="dxa" w:w="2608"/>
           </w:tcPr>
           <w:p>
             <w:pPr>
-              <w:spacing w:after="40" w:line="252" w:lineRule="auto"/>
+              <w:spacing w:after="0" w:line="240" w:lineRule="auto"/>
             </w:pPr>
             <w:r/>
             <w:r>
               <w:rPr>
-                <w:sz w:val="20"/>
+                <w:sz w:val="18"/>
               </w:rPr>
-              <w:t>Quem desenvolve para iPhone e Mac, trabalha com Docker e back-end e quer bateria longa.</w:t>
+              <w:t>ThinkPad T14 Gen 2</w:t>
+              <w:br/>
+              <w:t>i5-1145G7, 16 GB, SSD 512 GB</w:t>
             </w:r>
           </w:p>
         </w:tc>
         <w:tc>
           <w:tcPr>
-            <w:tcW w:type="dxa" w:w="2154"/>
+            <w:tcW w:type="dxa" w:w="3005"/>
           </w:tcPr>
           <w:p>
             <w:pPr>
-              <w:spacing w:after="40" w:line="252" w:lineRule="auto"/>
+              <w:spacing w:after="0" w:line="240" w:lineRule="auto"/>
             </w:pPr>
             <w:r/>
             <w:r>
               <w:rPr>
-                <w:sz w:val="20"/>
+                <w:sz w:val="18"/>
               </w:rPr>
-              <w:t>R$ 30.999,00</w:t>
+              <w:t>Começo da faculdade: IDE, banco de dados e Docker leve.</w:t>
+            </w:r>
+          </w:p>
+        </w:tc>
+        <w:tc>
+          <w:tcPr>
+            <w:tcW w:type="dxa" w:w="2948"/>
+          </w:tcPr>
+          <w:p>
+            <w:pPr>
+              <w:spacing w:after="0" w:line="240" w:lineRule="auto"/>
+            </w:pPr>
+            <w:r/>
+            <w:r>
+              <w:rPr>
+                <w:sz w:val="18"/>
+              </w:rPr>
+              <w:t>R$ 2.899,00 · R$ 2.609,10 no PIX</w:t>
               <w:br/>
-              <w:t>ou R$ 27.899,10 no PIX</w:t>
+              <w:t>12x de R$ 241,58</w:t>
             </w:r>
           </w:p>
         </w:tc>
       </w:tr>
       <w:tr>
-        <w:trPr>
-          <w:cantSplit w:val="true"/>
-        </w:trPr>
         <w:tc>
           <w:tcPr>
-            <w:tcW w:type="dxa" w:w="2835"/>
+            <w:tcW w:type="dxa" w:w="1304"/>
           </w:tcPr>
           <w:p>
             <w:pPr>
-              <w:spacing w:after="40" w:line="252" w:lineRule="auto"/>
+              <w:spacing w:after="0" w:line="240" w:lineRule="auto"/>
             </w:pPr>
             <w:r/>
             <w:r>
               <w:rPr>
                 <w:b/>
-                <w:sz w:val="20"/>
+                <w:sz w:val="18"/>
               </w:rPr>
-              <w:t>Galaxy Book6 Pro 14</w:t>
-              <w:br/>
-              <w:t>Core Ultra X7, 32 GB, SSD 1 TB</w:t>
+              <w:t>Intermediário</w:t>
             </w:r>
           </w:p>
         </w:tc>
         <w:tc>
           <w:tcPr>
-            <w:tcW w:type="dxa" w:w="4195"/>
+            <w:tcW w:type="dxa" w:w="2608"/>
           </w:tcPr>
           <w:p>
             <w:pPr>
-              <w:spacing w:after="40" w:line="252" w:lineRule="auto"/>
+              <w:spacing w:after="0" w:line="240" w:lineRule="auto"/>
             </w:pPr>
             <w:r/>
             <w:r>
               <w:rPr>
-                <w:sz w:val="20"/>
+                <w:sz w:val="18"/>
               </w:rPr>
-              <w:t>Quem trabalha no Windows com WSL, .NET e ferramentas da Microsoft e quer um notebook leve.</w:t>
+              <w:t>Dell Latitude 5430</w:t>
+              <w:br/>
+              <w:t>i7-1265U, 32 GB, SSD 1 TB</w:t>
             </w:r>
           </w:p>
         </w:tc>
         <w:tc>
           <w:tcPr>
-            <w:tcW w:type="dxa" w:w="2154"/>
+            <w:tcW w:type="dxa" w:w="3005"/>
           </w:tcPr>
           <w:p>
             <w:pPr>
-              <w:spacing w:after="40" w:line="252" w:lineRule="auto"/>
+              <w:spacing w:after="0" w:line="240" w:lineRule="auto"/>
             </w:pPr>
             <w:r/>
             <w:r>
               <w:rPr>
-                <w:sz w:val="20"/>
+                <w:sz w:val="18"/>
               </w:rPr>
-              <w:t>R$ 13.999,00</w:t>
+              <w:t>Estágio e back-end: containers e máquina virtual juntos.</w:t>
+            </w:r>
+          </w:p>
+        </w:tc>
+        <w:tc>
+          <w:tcPr>
+            <w:tcW w:type="dxa" w:w="2948"/>
+          </w:tcPr>
+          <w:p>
+            <w:pPr>
+              <w:spacing w:after="0" w:line="240" w:lineRule="auto"/>
+            </w:pPr>
+            <w:r/>
+            <w:r>
+              <w:rPr>
+                <w:sz w:val="18"/>
+              </w:rPr>
+              <w:t>R$ 4.999,00 · R$ 4.499,10 no PIX</w:t>
               <w:br/>
-              <w:t>ou R$ 12.599,10 no PIX</w:t>
+              <w:t>12x de R$ 416,58</w:t>
+            </w:r>
+          </w:p>
+        </w:tc>
+      </w:tr>
+      <w:tr>
+        <w:tc>
+          <w:tcPr>
+            <w:tcW w:type="dxa" w:w="1304"/>
+          </w:tcPr>
+          <w:p>
+            <w:pPr>
+              <w:spacing w:after="0" w:line="240" w:lineRule="auto"/>
+            </w:pPr>
+            <w:r/>
+            <w:r>
+              <w:rPr>
+                <w:b/>
+                <w:sz w:val="18"/>
+              </w:rPr>
+              <w:t>Pro</w:t>
+            </w:r>
+          </w:p>
+        </w:tc>
+        <w:tc>
+          <w:tcPr>
+            <w:tcW w:type="dxa" w:w="2608"/>
+          </w:tcPr>
+          <w:p>
+            <w:pPr>
+              <w:spacing w:after="0" w:line="240" w:lineRule="auto"/>
+            </w:pPr>
+            <w:r/>
+            <w:r>
+              <w:rPr>
+                <w:sz w:val="18"/>
+              </w:rPr>
+              <w:t>MacBook Air 13 (M2)</w:t>
+              <w:br/>
+              <w:t>16 GB, SSD 512 GB</w:t>
+            </w:r>
+          </w:p>
+        </w:tc>
+        <w:tc>
+          <w:tcPr>
+            <w:tcW w:type="dxa" w:w="3005"/>
+          </w:tcPr>
+          <w:p>
+            <w:pPr>
+              <w:spacing w:after="0" w:line="240" w:lineRule="auto"/>
+            </w:pPr>
+            <w:r/>
+            <w:r>
+              <w:rPr>
+                <w:sz w:val="18"/>
+              </w:rPr>
+              <w:t>Quem precisa do macOS e do Xcode, com bateria para o dia.</w:t>
+            </w:r>
+          </w:p>
+        </w:tc>
+        <w:tc>
+          <w:tcPr>
+            <w:tcW w:type="dxa" w:w="2948"/>
+          </w:tcPr>
+          <w:p>
+            <w:pPr>
+              <w:spacing w:after="0" w:line="240" w:lineRule="auto"/>
+            </w:pPr>
+            <w:r/>
+            <w:r>
+              <w:rPr>
+                <w:sz w:val="18"/>
+              </w:rPr>
+              <w:t>R$ 6.999,00 · R$ 6.299,10 no PIX</w:t>
+              <w:br/>
+              <w:t>12x de R$ 583,25</w:t>
             </w:r>
           </w:p>
         </w:tc>
@@ -819,16 +818,14 @@
     </w:tbl>
     <w:p>
       <w:pPr>
-        <w:spacing w:after="40"/>
+        <w:spacing w:before="60"/>
       </w:pPr>
-    </w:p>
-    <w:p>
       <w:r>
         <w:rPr>
           <w:color w:val="5A5C63"/>
-          <w:sz w:val="18"/>
+          <w:sz w:val="17"/>
         </w:rPr>
-        <w:t>Preços de referência de outubro de 2026, pesquisados na imprensa especializada. Por ser um projeto acadêmico, os valores podem ser ajustados.</w:t>
+        <w:t>Estado B custa R$ 200 a menos. Upgrade antes do envio: Entrada para 32 GB (+R$ 450,00) ou SSD de 1 TB (+R$ 350,00); Intermediário para SSD de 2 TB (+R$ 650,00); MacBook sem upgrade (memória e SSD soldados).</w:t>
       </w:r>
     </w:p>
     <w:p>
@@ -836,43 +833,47 @@
         <w:pStyle w:val="Heading1"/>
       </w:pPr>
       <w:r>
-        <w:t>6. Por que só dois produtos</w:t>
+        <w:t>4. Personas (fictícias)</w:t>
       </w:r>
     </w:p>
     <w:p>
-      <w:pPr>
-        <w:pStyle w:val="ListBullet"/>
-        <w:spacing w:after="60"/>
-      </w:pPr>
       <w:r>
-        <w:t>cobrem os dois sistemas que a área de TI usa no dia a dia: macOS e Windows;</w:t>
+        <w:rPr>
+          <w:b/>
+        </w:rPr>
+        <w:t xml:space="preserve">Mariana, 20 anos, estudante de ADS: </w:t>
+      </w:r>
+      <w:r/>
+      <w:r>
+        <w:t>o notebook da família trava no Android Studio e o orçamento é curto. Escolhe a Entrada em estado B, vê nas fotos a bateria com 85% e parcela em 12x sem juros.</w:t>
       </w:r>
     </w:p>
     <w:p>
-      <w:pPr>
-        <w:pStyle w:val="ListBullet"/>
-        <w:spacing w:after="60"/>
-      </w:pPr>
       <w:r>
-        <w:t>a decisão fica simples: em vez de escolher entre dezenas, o cliente escolhe entre dois;</w:t>
+        <w:rPr>
+          <w:b/>
+        </w:rPr>
+        <w:t>Rafael, 29 anos, back-end PJ:</w:t>
+      </w:r>
+      <w:r>
+        <w:t xml:space="preserve"> </w:t>
+      </w:r>
+      <w:r>
+        <w:t>os 16 GB já não dão conta dos containers. Escolhe o Dell Latitude de 32 GB com o kit Back-end, nota no CNPJ e PIX com 10% de desconto.</w:t>
       </w:r>
     </w:p>
     <w:p>
-      <w:pPr>
-        <w:pStyle w:val="ListBullet"/>
-        <w:spacing w:after="60"/>
-      </w:pPr>
       <w:r>
-        <w:t>quem atende conhece os dois a fundo e responde com segurança;</w:t>
+        <w:rPr>
+          <w:b/>
+        </w:rPr>
+        <w:t>Beatriz, 24 anos, front-end freelancer:</w:t>
       </w:r>
-    </w:p>
-    <w:p>
-      <w:pPr>
-        <w:pStyle w:val="ListBullet"/>
-        <w:spacing w:after="60"/>
-      </w:pPr>
       <w:r>
-        <w:t>estoque menor e mais controlado, o que reduz custo e erro.</w:t>
+        <w:t xml:space="preserve"> </w:t>
+      </w:r>
+      <w:r>
+        <w:t>precisa do macOS para testar no Safari e no iPhone, mas teme bateria viciada. Escolhe o MacBook Air M2 com a bateria informada e recebe as fotos e o checklist antes do envio.</w:t>
       </w:r>
     </w:p>
     <w:p>
@@ -880,43 +881,12 @@
         <w:pStyle w:val="Heading1"/>
       </w:pPr>
       <w:r>
-        <w:t>7. Por que vender pelo WhatsApp</w:t>
+        <w:t>5. Por que três modelos e WhatsApp</w:t>
       </w:r>
     </w:p>
     <w:p>
-      <w:pPr>
-        <w:pStyle w:val="ListBullet"/>
-        <w:spacing w:after="60"/>
-      </w:pPr>
       <w:r>
-        <w:t>é onde o cliente já conversa todo dia, sem instalar nada nem criar conta;</w:t>
-      </w:r>
-    </w:p>
-    <w:p>
-      <w:pPr>
-        <w:pStyle w:val="ListBullet"/>
-        <w:spacing w:after="60"/>
-      </w:pPr>
-      <w:r>
-        <w:t>compra cara pede conversa: o cliente tira a dúvida e fecha no mesmo lugar;</w:t>
-      </w:r>
-    </w:p>
-    <w:p>
-      <w:pPr>
-        <w:pStyle w:val="ListBullet"/>
-        <w:spacing w:after="60"/>
-      </w:pPr>
-      <w:r>
-        <w:t>o vendedor confirma estoque, envia a chave PIX ou o link do cartão e manda o rastreio na mesma conversa;</w:t>
-      </w:r>
-    </w:p>
-    <w:p>
-      <w:pPr>
-        <w:pStyle w:val="ListBullet"/>
-        <w:spacing w:after="60"/>
-      </w:pPr>
-      <w:r>
-        <w:t>o histórico do pedido fica salvo no celular do cliente, junto com o código do pedido.</w:t>
+        <w:t>Três modelos deixam a escolha simples e cabem na rotina de uma pessoa só, que conhece cada um a fundo e sabe o que revisar. O WhatsApp é onde o cliente já conversa: ele pergunta da bateria, recebe o PIX ou o link do cartão, as fotos da revisão e o rastreio na mesma conversa, e aciona a garantia por ali.</w:t>
       </w:r>
     </w:p>
     <w:p>
@@ -924,21 +894,24 @@
         <w:pStyle w:val="Heading1"/>
       </w:pPr>
       <w:r>
-        <w:t>8. Proposta de valor</w:t>
+        <w:t>6. Proposta de valor</w:t>
       </w:r>
     </w:p>
     <w:p>
+      <w:pPr>
+        <w:spacing w:after="0"/>
+      </w:pPr>
       <w:r>
         <w:rPr>
           <w:i/>
-          <w:sz w:val="24"/>
+          <w:sz w:val="22"/>
         </w:rPr>
-        <w:t>"Dois notebooks escolhidos para quem programa, explicados por quem entende e comprados numa conversa pelo WhatsApp."</w:t>
+        <w:t>"Notebook seminovo revisado, com a bateria conferida e pronto para programar, de quem entende de código e atende pelo WhatsApp."</w:t>
       </w:r>
     </w:p>
     <w:sectPr>
-      <w:pgSz w:w="12240" w:h="15840"/>
-      <w:pgMar w:top="1247" w:right="1361" w:bottom="1247" w:left="1361" w:header="720" w:footer="720" w:gutter="0"/>
+      <w:pgSz w:w="11906" w:h="16838"/>
+      <w:pgMar w:top="850" w:right="1020" w:bottom="850" w:left="1020" w:header="720" w:footer="720" w:gutter="0"/>
       <w:cols w:space="720"/>
       <w:docGrid w:linePitch="360"/>
     </w:sectPr>
@@ -1310,12 +1283,12 @@
     <w:qFormat/>
     <w:rsid w:val="00FC693F"/>
     <w:pPr>
-      <w:spacing w:after="120" w:line="276" w:lineRule="auto"/>
+      <w:spacing w:after="60" w:line="252" w:lineRule="auto"/>
     </w:pPr>
     <w:rPr>
       <w:rFonts w:ascii="Calibri" w:hAnsi="Calibri"/>
       <w:color w:val="1C1D21"/>
-      <w:sz w:val="22"/>
+      <w:sz w:val="20"/>
     </w:rPr>
   </w:style>
   <w:style w:type="paragraph" w:styleId="Header">
@@ -1373,7 +1346,7 @@
     <w:pPr>
       <w:keepNext/>
       <w:keepLines/>
-      <w:spacing w:before="280" w:after="80"/>
+      <w:spacing w:before="140" w:after="40"/>
       <w:outlineLvl w:val="0"/>
     </w:pPr>
     <w:rPr>
@@ -1381,7 +1354,7 @@
       <w:b/>
       <w:bCs/>
       <w:color w:val="1C1D21"/>
-      <w:sz w:val="30"/>
+      <w:sz w:val="24"/>
       <w:szCs w:val="28"/>
     </w:rPr>
   </w:style>
@@ -1397,15 +1370,15 @@
     <w:pPr>
       <w:keepNext/>
       <w:keepLines/>
-      <w:spacing w:before="280" w:after="80"/>
+      <w:spacing w:before="200" w:after="0"/>
       <w:outlineLvl w:val="1"/>
     </w:pPr>
     <w:rPr>
-      <w:rFonts w:asciiTheme="majorHAnsi" w:eastAsiaTheme="majorEastAsia" w:hAnsiTheme="majorHAnsi" w:cstheme="majorBidi" w:ascii="Calibri" w:hAnsi="Calibri"/>
+      <w:rFonts w:asciiTheme="majorHAnsi" w:eastAsiaTheme="majorEastAsia" w:hAnsiTheme="majorHAnsi" w:cstheme="majorBidi"/>
       <w:b/>
       <w:bCs/>
-      <w:color w:val="1C1D21"/>
-      <w:sz w:val="25"/>
+      <w:color w:val="4F81BD" w:themeColor="accent1"/>
+      <w:sz w:val="26"/>
       <w:szCs w:val="26"/>
     </w:rPr>
   </w:style>

</xml_diff>